<commit_message>
Populate author metadata and prepared repository URL
</commit_message>
<xml_diff>
--- a/paper/manuscript.docx
+++ b/paper/manuscript.docx
@@ -2875,7 +2875,7 @@
         <w:t xml:space="preserve"> </w:t>
       </w:r>
       <w:r>
-        <w:t xml:space="preserve">The manuscript repository is available at</w:t>
+        <w:t xml:space="preserve">The reviewed manuscript repository will be made publicly available at</w:t>
       </w:r>
       <w:r>
         <w:t xml:space="preserve"> </w:t>
@@ -2926,13 +2926,13 @@
         <w:pStyle w:val="FirstParagraph"/>
       </w:pPr>
       <w:r>
-        <w:t xml:space="preserve">The complete analysis and figure code, frozen configurations, tests and aggregate result tables are</w:t>
-      </w:r>
-      <w:r>
-        <w:t xml:space="preserve"> </w:t>
-      </w:r>
-      <w:r>
-        <w:t xml:space="preserve">available at</w:t>
+        <w:t xml:space="preserve">The complete analysis and figure code, frozen configurations, tests and aggregate result tables will</w:t>
+      </w:r>
+      <w:r>
+        <w:t xml:space="preserve"> </w:t>
+      </w:r>
+      <w:r>
+        <w:t xml:space="preserve">be made publicly available at</w:t>
       </w:r>
       <w:r>
         <w:t xml:space="preserve"> </w:t>
@@ -2946,19 +2946,19 @@
         </w:r>
       </w:hyperlink>
       <w:r>
-        <w:t xml:space="preserve">. Immutable</w:t>
-      </w:r>
-      <w:r>
-        <w:t xml:space="preserve"> </w:t>
-      </w:r>
-      <w:r>
-        <w:t xml:space="preserve">commits and manifests are included. No language model or post-cutoff biological database was used</w:t>
-      </w:r>
-      <w:r>
-        <w:t xml:space="preserve"> </w:t>
-      </w:r>
-      <w:r>
-        <w:t xml:space="preserve">as a model feature or to rank targets.</w:t>
+        <w:t xml:space="preserve">. Immutable commits and</w:t>
+      </w:r>
+      <w:r>
+        <w:t xml:space="preserve"> </w:t>
+      </w:r>
+      <w:r>
+        <w:t xml:space="preserve">manifests are included. No language model or post-cutoff biological database was used as a model</w:t>
+      </w:r>
+      <w:r>
+        <w:t xml:space="preserve"> </w:t>
+      </w:r>
+      <w:r>
+        <w:t xml:space="preserve">feature or to rank targets.</w:t>
       </w:r>
     </w:p>
     <w:bookmarkEnd w:id="48"/>

</xml_diff>

<commit_message>
Prepare single-author preprint approval candidate
</commit_message>
<xml_diff>
--- a/paper/manuscript.docx
+++ b/paper/manuscript.docx
@@ -89,7 +89,7 @@
         <w:pStyle w:val="Date"/>
       </w:pPr>
       <w:r>
-        <w:t xml:space="preserve">25</w:t>
+        <w:t xml:space="preserve">30</w:t>
       </w:r>
       <w:r>
         <w:t xml:space="preserve"> </w:t>
@@ -119,7 +119,7 @@
         <w:t xml:space="preserve"> </w:t>
       </w:r>
       <w:r>
-        <w:t xml:space="preserve">Analysis</w:t>
+        <w:t xml:space="preserve">Preprint / research report</w:t>
       </w:r>
       <w:r>
         <w:br/>
@@ -129,17 +129,17 @@
           <w:bCs/>
           <w:b/>
         </w:rPr>
-        <w:t xml:space="preserve">Target journal:</w:t>
-      </w:r>
-      <w:r>
-        <w:t xml:space="preserve"> </w:t>
-      </w:r>
-      <w:r>
-        <w:rPr>
-          <w:iCs/>
-          <w:i/>
-        </w:rPr>
-        <w:t xml:space="preserve">Nature Aging</w:t>
+        <w:t xml:space="preserve">Status:</w:t>
+      </w:r>
+      <w:r>
+        <w:t xml:space="preserve"> </w:t>
+      </w:r>
+      <w:r>
+        <w:rPr>
+          <w:bCs/>
+          <w:b/>
+        </w:rPr>
+        <w:t xml:space="preserve">Preprint — not peer reviewed.</w:t>
       </w:r>
       <w:r>
         <w:br/>
@@ -2875,7 +2875,7 @@
         <w:t xml:space="preserve"> </w:t>
       </w:r>
       <w:r>
-        <w:t xml:space="preserve">The reviewed manuscript repository will be made publicly available at</w:t>
+        <w:t xml:space="preserve">The reviewed manuscript repository is prepared for public release at</w:t>
       </w:r>
       <w:r>
         <w:t xml:space="preserve"> </w:t>
@@ -2885,30 +2885,17 @@
           <w:rPr>
             <w:rStyle w:val="Hyperlink"/>
           </w:rPr>
-          <w:t xml:space="preserve">https://github.com/Metastatebio/transcriptomic-reprogramming-portability</w:t>
+          <w:t xml:space="preserve">https://github.com/otcan/transcriptomic-reprogramming-portability</w:t>
         </w:r>
       </w:hyperlink>
       <w:r>
-        <w:t xml:space="preserve">. The immutable archival</w:t>
-      </w:r>
-      <w:r>
-        <w:t xml:space="preserve"> </w:t>
-      </w:r>
-      <w:r>
-        <w:t xml:space="preserve">DOI will be inserted before submission:</w:t>
-      </w:r>
-      <w:r>
-        <w:t xml:space="preserve"> </w:t>
-      </w:r>
-      <w:r>
-        <w:rPr>
-          <w:bCs/>
-          <w:b/>
-        </w:rPr>
-        <w:t xml:space="preserve">[ZENODO DOI — REQUIRED BEFORE SUBMISSION]</w:t>
-      </w:r>
-      <w:r>
-        <w:t xml:space="preserve">.</w:t>
+        <w:t xml:space="preserve">. The immutable archival DOI</w:t>
+      </w:r>
+      <w:r>
+        <w:t xml:space="preserve"> </w:t>
+      </w:r>
+      <w:r>
+        <w:t xml:space="preserve">will be added to the public record when the approved release is deposited.</w:t>
       </w:r>
     </w:p>
     <w:bookmarkEnd w:id="47"/>
@@ -2926,13 +2913,13 @@
         <w:pStyle w:val="FirstParagraph"/>
       </w:pPr>
       <w:r>
-        <w:t xml:space="preserve">The complete analysis and figure code, frozen configurations, tests and aggregate result tables will</w:t>
-      </w:r>
-      <w:r>
-        <w:t xml:space="preserve"> </w:t>
-      </w:r>
-      <w:r>
-        <w:t xml:space="preserve">be made publicly available at</w:t>
+        <w:t xml:space="preserve">The complete analysis and figure code, frozen configurations, tests and aggregate result tables are</w:t>
+      </w:r>
+      <w:r>
+        <w:t xml:space="preserve"> </w:t>
+      </w:r>
+      <w:r>
+        <w:t xml:space="preserve">prepared for public release at</w:t>
       </w:r>
       <w:r>
         <w:t xml:space="preserve"> </w:t>
@@ -2942,7 +2929,7 @@
           <w:rPr>
             <w:rStyle w:val="Hyperlink"/>
           </w:rPr>
-          <w:t xml:space="preserve">https://github.com/Metastatebio/transcriptomic-reprogramming-portability</w:t>
+          <w:t xml:space="preserve">https://github.com/otcan/transcriptomic-reprogramming-portability</w:t>
         </w:r>
       </w:hyperlink>
       <w:r>
@@ -2996,7 +2983,7 @@
         <w:t xml:space="preserve"> </w:t>
       </w:r>
       <w:r>
-        <w:t xml:space="preserve">literature organization and manuscript drafting. The authors inspected the source data, code,</w:t>
+        <w:t xml:space="preserve">literature organization and manuscript drafting. The author inspected the source data, code,</w:t>
       </w:r>
       <w:r>
         <w:t xml:space="preserve"> </w:t>

</xml_diff>

<commit_message>
Revise manuscript after portability review
</commit_message>
<xml_diff>
--- a/paper/manuscript.docx
+++ b/paper/manuscript.docx
@@ -7,7 +7,13 @@
         <w:pStyle w:val="Title"/>
       </w:pPr>
       <w:r>
-        <w:t xml:space="preserve">Chronological-age</w:t>
+        <w:t xml:space="preserve">Five</w:t>
+      </w:r>
+      <w:r>
+        <w:t xml:space="preserve"> </w:t>
+      </w:r>
+      <w:r>
+        <w:t xml:space="preserve">chronological-age</w:t>
       </w:r>
       <w:r>
         <w:t xml:space="preserve"> </w:t>
@@ -25,49 +31,49 @@
         <w:t xml:space="preserve"> </w:t>
       </w:r>
       <w:r>
-        <w:t xml:space="preserve">are</w:t>
-      </w:r>
-      <w:r>
-        <w:t xml:space="preserve"> </w:t>
-      </w:r>
-      <w:r>
-        <w:t xml:space="preserve">not</w:t>
-      </w:r>
-      <w:r>
-        <w:t xml:space="preserve"> </w:t>
-      </w:r>
-      <w:r>
-        <w:t xml:space="preserve">portable</w:t>
-      </w:r>
-      <w:r>
-        <w:t xml:space="preserve"> </w:t>
-      </w:r>
-      <w:r>
-        <w:t xml:space="preserve">scalar</w:t>
-      </w:r>
-      <w:r>
-        <w:t xml:space="preserve"> </w:t>
-      </w:r>
-      <w:r>
-        <w:t xml:space="preserve">readouts</w:t>
-      </w:r>
-      <w:r>
-        <w:t xml:space="preserve"> </w:t>
-      </w:r>
-      <w:r>
-        <w:t xml:space="preserve">of</w:t>
-      </w:r>
-      <w:r>
-        <w:t xml:space="preserve"> </w:t>
-      </w:r>
-      <w:r>
-        <w:t xml:space="preserve">partial</w:t>
-      </w:r>
-      <w:r>
-        <w:t xml:space="preserve"> </w:t>
-      </w:r>
-      <w:r>
-        <w:t xml:space="preserve">reprogramming</w:t>
+        <w:t xml:space="preserve">fail</w:t>
+      </w:r>
+      <w:r>
+        <w:t xml:space="preserve"> </w:t>
+      </w:r>
+      <w:r>
+        <w:t xml:space="preserve">a</w:t>
+      </w:r>
+      <w:r>
+        <w:t xml:space="preserve"> </w:t>
+      </w:r>
+      <w:r>
+        <w:t xml:space="preserve">locked</w:t>
+      </w:r>
+      <w:r>
+        <w:t xml:space="preserve"> </w:t>
+      </w:r>
+      <w:r>
+        <w:t xml:space="preserve">portability</w:t>
+      </w:r>
+      <w:r>
+        <w:t xml:space="preserve"> </w:t>
+      </w:r>
+      <w:r>
+        <w:t xml:space="preserve">benchmark</w:t>
+      </w:r>
+      <w:r>
+        <w:t xml:space="preserve"> </w:t>
+      </w:r>
+      <w:r>
+        <w:t xml:space="preserve">across</w:t>
+      </w:r>
+      <w:r>
+        <w:t xml:space="preserve"> </w:t>
+      </w:r>
+      <w:r>
+        <w:t xml:space="preserve">partial-reprogramming</w:t>
+      </w:r>
+      <w:r>
+        <w:t xml:space="preserve"> </w:t>
+      </w:r>
+      <w:r>
+        <w:t xml:space="preserve">interventions</w:t>
       </w:r>
     </w:p>
     <w:p>
@@ -119,17 +125,27 @@
         <w:t xml:space="preserve"> </w:t>
       </w:r>
       <w:r>
-        <w:t xml:space="preserve">Preprint / research report</w:t>
-      </w:r>
-      <w:r>
-        <w:br/>
+        <w:t xml:space="preserve">Analysis</w:t>
+      </w:r>
+      <w:r>
+        <w:t xml:space="preserve"> </w:t>
       </w:r>
       <w:r>
         <w:rPr>
           <w:bCs/>
           <w:b/>
         </w:rPr>
-        <w:t xml:space="preserve">Status:</w:t>
+        <w:t xml:space="preserve">Target journal:</w:t>
+      </w:r>
+      <w:r>
+        <w:t xml:space="preserve"> </w:t>
+      </w:r>
+      <w:r>
+        <w:rPr>
+          <w:iCs/>
+          <w:i/>
+        </w:rPr>
+        <w:t xml:space="preserve">Nature Aging</w:t>
       </w:r>
       <w:r>
         <w:t xml:space="preserve"> </w:t>
@@ -139,32 +155,22 @@
           <w:bCs/>
           <w:b/>
         </w:rPr>
-        <w:t xml:space="preserve">Preprint — not peer reviewed.</w:t>
-      </w:r>
-      <w:r>
-        <w:br/>
+        <w:t xml:space="preserve">Affiliation:</w:t>
+      </w:r>
+      <w:r>
+        <w:t xml:space="preserve"> </w:t>
+      </w:r>
+      <w:r>
+        <w:t xml:space="preserve">Metastate Bio Inc, Wilmington, Delaware, USA</w:t>
+      </w:r>
+      <w:r>
+        <w:t xml:space="preserve"> </w:t>
       </w:r>
       <w:r>
         <w:rPr>
           <w:bCs/>
           <w:b/>
         </w:rPr>
-        <w:t xml:space="preserve">Affiliation:</w:t>
-      </w:r>
-      <w:r>
-        <w:t xml:space="preserve"> </w:t>
-      </w:r>
-      <w:r>
-        <w:t xml:space="preserve">Metastate Bio Inc, Wilmington, Delaware, USA</w:t>
-      </w:r>
-      <w:r>
-        <w:br/>
-      </w:r>
-      <w:r>
-        <w:rPr>
-          <w:bCs/>
-          <w:b/>
-        </w:rPr>
         <w:t xml:space="preserve">Corresponding author:</w:t>
       </w:r>
       <w:r>
@@ -180,7 +186,7 @@
         <w:t xml:space="preserve">0009-0007-2023-5084</w:t>
       </w:r>
     </w:p>
-    <w:bookmarkStart w:id="35" w:name="abstract"/>
+    <w:bookmarkStart w:id="39" w:name="abstract"/>
     <w:p>
       <w:pPr>
         <w:pStyle w:val="Heading1"/>
@@ -194,79 +200,85 @@
         <w:pStyle w:val="FirstParagraph"/>
       </w:pPr>
       <w:r>
-        <w:t xml:space="preserve">Transcriptomic age models are applied to reprogramming experiments as scalar measures</w:t>
-      </w:r>
-      <w:r>
-        <w:t xml:space="preserve"> </w:t>
-      </w:r>
-      <w:r>
-        <w:t xml:space="preserve">of cellular rejuvenation, although prediction of chronological age does not establish sensitivity to</w:t>
-      </w:r>
-      <w:r>
-        <w:t xml:space="preserve"> </w:t>
-      </w:r>
-      <w:r>
-        <w:t xml:space="preserve">beneficial intervention. We constructed a temporally locked four-axis framework from public data</w:t>
-      </w:r>
-      <w:r>
-        <w:t xml:space="preserve"> </w:t>
-      </w:r>
-      <w:r>
-        <w:t xml:space="preserve">available by 2024, challenged it against later studies without refitting, and then compared five</w:t>
-      </w:r>
-      <w:r>
-        <w:t xml:space="preserve"> </w:t>
-      </w:r>
-      <w:r>
-        <w:t xml:space="preserve">evaluable age-direction models across 184 contrasts from partial-reprogramming datasets. The frozen</w:t>
-      </w:r>
-      <w:r>
-        <w:t xml:space="preserve"> </w:t>
-      </w:r>
-      <w:r>
-        <w:t xml:space="preserve">positive framework failed its human chemical and trajectory-order endpoints, and later-tested targets</w:t>
-      </w:r>
-      <w:r>
-        <w:t xml:space="preserve"> </w:t>
-      </w:r>
-      <w:r>
-        <w:t xml:space="preserve">were not enriched. All five benchmark models oriented two independent young–old controls correctly,</w:t>
-      </w:r>
-      <w:r>
-        <w:t xml:space="preserve"> </w:t>
-      </w:r>
-      <w:r>
-        <w:t xml:space="preserve">but median pairwise agreement on intervention direction was 0.745, below a locked 0.80 criterion.</w:t>
-      </w:r>
-      <w:r>
-        <w:t xml:space="preserve"> </w:t>
-      </w:r>
-      <w:r>
-        <w:t xml:space="preserve">No model was youthward in at least 80% of eight source-labelled favourable study families; the best</w:t>
-      </w:r>
-      <w:r>
-        <w:t xml:space="preserve"> </w:t>
-      </w:r>
-      <w:r>
-        <w:t xml:space="preserve">fraction was 0.625. Gene-level intervention directions were also weakly concordant across families.</w:t>
-      </w:r>
-      <w:r>
-        <w:t xml:space="preserve"> </w:t>
-      </w:r>
-      <w:r>
-        <w:t xml:space="preserve">Thus, chronological-age transcriptomic directions were not portable scalar readouts of partial</w:t>
-      </w:r>
-      <w:r>
-        <w:t xml:space="preserve"> </w:t>
-      </w:r>
-      <w:r>
-        <w:t xml:space="preserve">reprogramming. Rejuvenation claims require intervention-specific and orthogonal</w:t>
-      </w:r>
-      <w:r>
-        <w:t xml:space="preserve"> </w:t>
-      </w:r>
-      <w:r>
-        <w:t xml:space="preserve">qualification beyond age prediction.</w:t>
+        <w:t xml:space="preserve">Chronological-age models are used as scalar measures of cellular rejuvenation, although age</w:t>
+      </w:r>
+      <w:r>
+        <w:t xml:space="preserve"> </w:t>
+      </w:r>
+      <w:r>
+        <w:t xml:space="preserve">prediction does not establish sensitivity to beneficial intervention. We constructed a temporally</w:t>
+      </w:r>
+      <w:r>
+        <w:t xml:space="preserve"> </w:t>
+      </w:r>
+      <w:r>
+        <w:t xml:space="preserve">locked four-axis framework from public data available by 2024, challenged it against later studies</w:t>
+      </w:r>
+      <w:r>
+        <w:t xml:space="preserve"> </w:t>
+      </w:r>
+      <w:r>
+        <w:t xml:space="preserve">without refitting, and compared five evaluable age directions across 184 partial-reprogramming</w:t>
+      </w:r>
+      <w:r>
+        <w:t xml:space="preserve"> </w:t>
+      </w:r>
+      <w:r>
+        <w:t xml:space="preserve">contrasts. The frozen positive framework failed its human chemical and trajectory-order endpoints.</w:t>
+      </w:r>
+      <w:r>
+        <w:t xml:space="preserve"> </w:t>
+      </w:r>
+      <w:r>
+        <w:t xml:space="preserve">All five benchmark models oriented two independent young–old controls correctly, but their median</w:t>
+      </w:r>
+      <w:r>
+        <w:t xml:space="preserve"> </w:t>
+      </w:r>
+      <w:r>
+        <w:t xml:space="preserve">pairwise agreement on intervention direction was 0.745. Equal weighting across 14 study families</w:t>
+      </w:r>
+      <w:r>
+        <w:t xml:space="preserve"> </w:t>
+      </w:r>
+      <w:r>
+        <w:t xml:space="preserve">reduced agreement to 0.623 (family-cluster bootstrap 95% interval 0.515–0.738). No model was</w:t>
+      </w:r>
+      <w:r>
+        <w:t xml:space="preserve"> </w:t>
+      </w:r>
+      <w:r>
+        <w:t xml:space="preserve">youthward in more than five of eight source-labelled favourable families. Cross-family gene effects</w:t>
+      </w:r>
+      <w:r>
+        <w:t xml:space="preserve"> </w:t>
+      </w:r>
+      <w:r>
+        <w:t xml:space="preserve">were weakly concordant relative to the within-family reproducibility estimable in four families. A</w:t>
+      </w:r>
+      <w:r>
+        <w:t xml:space="preserve"> </w:t>
+      </w:r>
+      <w:r>
+        <w:t xml:space="preserve">post-review exploratory application of the contemporary Pasta model oriented both age controls but</w:t>
+      </w:r>
+      <w:r>
+        <w:t xml:space="preserve"> </w:t>
+      </w:r>
+      <w:r>
+        <w:t xml:space="preserve">was positive in only four of eight favourable families. These results show that age prediction did</w:t>
+      </w:r>
+      <w:r>
+        <w:t xml:space="preserve"> </w:t>
+      </w:r>
+      <w:r>
+        <w:t xml:space="preserve">not establish intervention portability for the evaluated directions. Rejuvenation claims require</w:t>
+      </w:r>
+      <w:r>
+        <w:t xml:space="preserve"> </w:t>
+      </w:r>
+      <w:r>
+        <w:t xml:space="preserve">intervention-specific and orthogonal qualification.</w:t>
       </w:r>
     </w:p>
     <w:p>
@@ -1257,6 +1269,50 @@
         <w:pStyle w:val="BodyText"/>
       </w:pPr>
       <w:r>
+        <w:t xml:space="preserve">Because the 184 contrasts are clustered within studies and families, we added an explicitly</w:t>
+      </w:r>
+      <w:r>
+        <w:t xml:space="preserve"> </w:t>
+      </w:r>
+      <w:r>
+        <w:t xml:space="preserve">post-review, outcome-aware sensitivity under locked Amendment C1. Equal weighting of the 14</w:t>
+      </w:r>
+      <w:r>
+        <w:t xml:space="preserve"> </w:t>
+      </w:r>
+      <w:r>
+        <w:t xml:space="preserve">benchmark families lowered median pairwise agreement to 0.623. A 10,000-draw cluster bootstrap that</w:t>
+      </w:r>
+      <w:r>
+        <w:t xml:space="preserve"> </w:t>
+      </w:r>
+      <w:r>
+        <w:t xml:space="preserve">resampled families gave a percentile interval of 0.515–0.738, and leave-one-family-out estimates</w:t>
+      </w:r>
+      <w:r>
+        <w:t xml:space="preserve"> </w:t>
+      </w:r>
+      <w:r>
+        <w:t xml:space="preserve">ranged from 0.593 to 0.652 (Fig. 5a,b). The original contrast-weighted statistic is therefore not</w:t>
+      </w:r>
+      <w:r>
+        <w:t xml:space="preserve"> </w:t>
+      </w:r>
+      <w:r>
+        <w:t xml:space="preserve">presented as 184 independent experiments; the family-weighted result is the more conservative</w:t>
+      </w:r>
+      <w:r>
+        <w:t xml:space="preserve"> </w:t>
+      </w:r>
+      <w:r>
+        <w:t xml:space="preserve">summary.</w:t>
+      </w:r>
+    </w:p>
+    <w:p>
+      <w:pPr>
+        <w:pStyle w:val="BodyText"/>
+      </w:pPr>
+      <w:r>
         <w:t xml:space="preserve">The divergence was visible at the study-family level (Fig. 3c). MPTR was positive for every method,</w:t>
       </w:r>
       <w:r>
@@ -1287,19 +1343,31 @@
         <w:t xml:space="preserve"> </w:t>
       </w:r>
       <w:r>
-        <w:t xml:space="preserve">80% of eight source-labelled favourable families. The observed model fractions were 0.250–0.625;</w:t>
-      </w:r>
-      <w:r>
-        <w:t xml:space="preserve"> </w:t>
-      </w:r>
-      <w:r>
-        <w:t xml:space="preserve">none reached 0.80 (Fig. 3d). The labels describe favourable interpretations in source papers and are</w:t>
-      </w:r>
-      <w:r>
-        <w:t xml:space="preserve"> </w:t>
-      </w:r>
-      <w:r>
-        <w:t xml:space="preserve">not treated as ground-truth rejuvenation outcomes.</w:t>
+        <w:t xml:space="preserve">80% of eight source-labelled favourable families. With eight families, that rule requires at least</w:t>
+      </w:r>
+      <w:r>
+        <w:t xml:space="preserve"> </w:t>
+      </w:r>
+      <w:r>
+        <w:t xml:space="preserve">seven positive calls. The observed counts were two to five; only one method reached four or five,</w:t>
+      </w:r>
+      <w:r>
+        <w:t xml:space="preserve"> </w:t>
+      </w:r>
+      <w:r>
+        <w:t xml:space="preserve">and none reached six, seven or eight. Thus the conclusion does not depend on treating 80% as a</w:t>
+      </w:r>
+      <w:r>
+        <w:t xml:space="preserve"> </w:t>
+      </w:r>
+      <w:r>
+        <w:t xml:space="preserve">biologically privileged boundary (Fig. 3d). The labels describe favourable interpretations in source</w:t>
+      </w:r>
+      <w:r>
+        <w:t xml:space="preserve"> </w:t>
+      </w:r>
+      <w:r>
+        <w:t xml:space="preserve">papers and are not ground-truth rejuvenation outcomes.</w:t>
       </w:r>
     </w:p>
     <w:p>
@@ -1433,6 +1501,44 @@
         <w:t xml:space="preserve">Fraction of source-labelled favourable families with positive mean effects.</w:t>
       </w:r>
     </w:p>
+    <w:p>
+      <w:pPr>
+        <w:pStyle w:val="BodyText"/>
+      </w:pPr>
+      <w:r>
+        <w:t xml:space="preserve">Descriptive stratification did not identify a broadly consistent subset. Median method agreement was</w:t>
+      </w:r>
+      <w:r>
+        <w:t xml:space="preserve"> </w:t>
+      </w:r>
+      <w:r>
+        <w:t xml:space="preserve">0.700 across five human families, 0.667 across three mouse families and 0.667 across six genetic</w:t>
+      </w:r>
+      <w:r>
+        <w:t xml:space="preserve"> </w:t>
+      </w:r>
+      <w:r>
+        <w:t xml:space="preserve">families. The five fibroblast families had a median of 0.800, but individual method pairs ranged from</w:t>
+      </w:r>
+      <w:r>
+        <w:t xml:space="preserve"> </w:t>
+      </w:r>
+      <w:r>
+        <w:t xml:space="preserve">0.400 to 1.000. The chemical and retinal strata each contained only two families and are too small</w:t>
+      </w:r>
+      <w:r>
+        <w:t xml:space="preserve"> </w:t>
+      </w:r>
+      <w:r>
+        <w:t xml:space="preserve">for general conclusions. These analyses localize heterogeneity but do not attribute it to species,</w:t>
+      </w:r>
+      <w:r>
+        <w:t xml:space="preserve"> </w:t>
+      </w:r>
+      <w:r>
+        <w:t xml:space="preserve">tissue or intervention class.</w:t>
+      </w:r>
+    </w:p>
     <w:bookmarkEnd w:id="30"/>
     <w:bookmarkStart w:id="34" w:name="Xf25eb7d8cdde9e035599c2bc0c2503b39bca04b"/>
     <w:p>
@@ -1510,13 +1616,63 @@
         <w:t xml:space="preserve"> </w:t>
       </w:r>
       <w:r>
-        <w:t xml:space="preserve">claimed. Together with the method sign matrix (Fig. 4a), the results show that portability failed at</w:t>
-      </w:r>
-      <w:r>
-        <w:t xml:space="preserve"> </w:t>
-      </w:r>
-      <w:r>
-        <w:t xml:space="preserve">both the scalar-score and genome-wide effect levels.</w:t>
+        <w:t xml:space="preserve">claimed.</w:t>
+      </w:r>
+    </w:p>
+    <w:p>
+      <w:pPr>
+        <w:pStyle w:val="BodyText"/>
+      </w:pPr>
+      <w:r>
+        <w:t xml:space="preserve">We estimated a partial noise ceiling wherever the design permitted split-half comparisons. Four of</w:t>
+      </w:r>
+      <w:r>
+        <w:t xml:space="preserve"> </w:t>
+      </w:r>
+      <w:r>
+        <w:t xml:space="preserve">eight favourable families had at least four contrast units; their median raw split-half correlations</w:t>
+      </w:r>
+      <w:r>
+        <w:t xml:space="preserve"> </w:t>
+      </w:r>
+      <w:r>
+        <w:t xml:space="preserve">were 0.323, 0.558, 0.678 and 0.840. Eight individual contrasts supported arm-split estimates, ranging</w:t>
+      </w:r>
+      <w:r>
+        <w:t xml:space="preserve"> </w:t>
+      </w:r>
+      <w:r>
+        <w:t xml:space="preserve">from 0.188 to 0.912. Reliability is therefore heterogeneous and unavailable for half the families,</w:t>
+      </w:r>
+      <w:r>
+        <w:t xml:space="preserve"> </w:t>
+      </w:r>
+      <w:r>
+        <w:t xml:space="preserve">but in the estimable higher-reliability contexts it substantially exceeds the cross-family median of</w:t>
+      </w:r>
+      <w:r>
+        <w:t xml:space="preserve"> </w:t>
+      </w:r>
+      <w:r>
+        <w:t xml:space="preserve">0.054. The weak cross-family concordance cannot be assigned entirely to measurement noise, although</w:t>
+      </w:r>
+      <w:r>
+        <w:t xml:space="preserve"> </w:t>
+      </w:r>
+      <w:r>
+        <w:t xml:space="preserve">the incomplete noise ceiling prevents a universal reliability-corrected claim. Together with the</w:t>
+      </w:r>
+      <w:r>
+        <w:t xml:space="preserve"> </w:t>
+      </w:r>
+      <w:r>
+        <w:t xml:space="preserve">method sign matrix (Fig. 4a), these results support non-convergence in the evaluated data at both the</w:t>
+      </w:r>
+      <w:r>
+        <w:t xml:space="preserve"> </w:t>
+      </w:r>
+      <w:r>
+        <w:t xml:space="preserve">scalar-score and gene-effect levels.</w:t>
       </w:r>
     </w:p>
     <w:p>
@@ -1651,8 +1807,273 @@
       </w:r>
     </w:p>
     <w:bookmarkEnd w:id="34"/>
-    <w:bookmarkEnd w:id="35"/>
-    <w:bookmarkStart w:id="36" w:name="discussion"/>
+    <w:bookmarkStart w:id="38" w:name="Xb6eaa2a89b5381fa1b117fa991a614de97b1f7c"/>
+    <w:p>
+      <w:pPr>
+        <w:pStyle w:val="Heading2"/>
+      </w:pPr>
+      <w:r>
+        <w:t xml:space="preserve">Robustness and a contemporary exploratory comparator</w:t>
+      </w:r>
+    </w:p>
+    <w:p>
+      <w:pPr>
+        <w:pStyle w:val="FirstParagraph"/>
+      </w:pPr>
+      <w:r>
+        <w:t xml:space="preserve">Observed coverage of the 10,532 historical-model features ranged from 85.1% to 100.0%, rather than</w:t>
+      </w:r>
+      <w:r>
+        <w:t xml:space="preserve"> </w:t>
+      </w:r>
+      <w:r>
+        <w:t xml:space="preserve">approaching the allowed 60% floor. Raising the eligibility threshold to 70% or 80% retained every</w:t>
+      </w:r>
+      <w:r>
+        <w:t xml:space="preserve"> </w:t>
+      </w:r>
+      <w:r>
+        <w:t xml:space="preserve">dataset and result. At 90%, five expression matrices and 49 contrasts remained; contrast-weighted</w:t>
+      </w:r>
+      <w:r>
+        <w:t xml:space="preserve"> </w:t>
+      </w:r>
+      <w:r>
+        <w:t xml:space="preserve">and equal-family agreements were 0.735 and 0.666. As a separate stress test, refitting all five</w:t>
+      </w:r>
+      <w:r>
+        <w:t xml:space="preserve"> </w:t>
+      </w:r>
+      <w:r>
+        <w:t xml:space="preserve">historical methods on the 8,427 features present across every benchmark matrix yielded agreements of</w:t>
+      </w:r>
+      <w:r>
+        <w:t xml:space="preserve"> </w:t>
+      </w:r>
+      <w:r>
+        <w:t xml:space="preserve">0.780 and 0.649, still below 0.80 (Fig. 5c).</w:t>
+      </w:r>
+    </w:p>
+    <w:p>
+      <w:pPr>
+        <w:pStyle w:val="BodyText"/>
+      </w:pPr>
+      <w:r>
+        <w:t xml:space="preserve">We also applied Pasta, a contemporary rank-based age-shift model released after the historical</w:t>
+      </w:r>
+      <w:r>
+        <w:t xml:space="preserve"> </w:t>
+      </w:r>
+      <w:r>
+        <w:t xml:space="preserve">cutoff, as a post-review exploratory comparator [14]. A Python reconstruction reproduced the three</w:t>
+      </w:r>
+      <w:r>
+        <w:t xml:space="preserve"> </w:t>
+      </w:r>
+      <w:r>
+        <w:t xml:space="preserve">bundled reference predictions to a maximum absolute error of</w:t>
+      </w:r>
+      <w:r>
+        <w:t xml:space="preserve"> </w:t>
+      </w:r>
+      <w:r>
+        <w:rPr>
+          <w:rStyle w:val="VerbatimChar"/>
+        </w:rPr>
+        <w:t xml:space="preserve">4.8×10^-11</w:t>
+      </w:r>
+      <w:r>
+        <w:t xml:space="preserve">. Pasta oriented both</w:t>
+      </w:r>
+      <w:r>
+        <w:t xml:space="preserve"> </w:t>
+      </w:r>
+      <w:r>
+        <w:t xml:space="preserve">young-minus-old controls correctly but was youthward in four of the eight favourable-labelled</w:t>
+      </w:r>
+      <w:r>
+        <w:t xml:space="preserve"> </w:t>
+      </w:r>
+      <w:r>
+        <w:t xml:space="preserve">families (Fig. 5d). Its feature coverage was 83.3–99.5%. This analysis was not part of B1, was added</w:t>
+      </w:r>
+      <w:r>
+        <w:t xml:space="preserve"> </w:t>
+      </w:r>
+      <w:r>
+        <w:t xml:space="preserve">after the historical outcomes were known, and does not constitute an independent prospective test.</w:t>
+      </w:r>
+      <w:r>
+        <w:t xml:space="preserve"> </w:t>
+      </w:r>
+      <w:r>
+        <w:t xml:space="preserve">No exact benchmark accession overlap was identified in the public article or model package, but a</w:t>
+      </w:r>
+      <w:r>
+        <w:t xml:space="preserve"> </w:t>
+      </w:r>
+      <w:r>
+        <w:t xml:space="preserve">complete sample-level audit of all 21 Pasta training datasets was not possible from the released</w:t>
+      </w:r>
+      <w:r>
+        <w:t xml:space="preserve"> </w:t>
+      </w:r>
+      <w:r>
+        <w:t xml:space="preserve">materials. We excluded the contemporary tAge model from this commercial-affiliation release because</w:t>
+      </w:r>
+      <w:r>
+        <w:t xml:space="preserve"> </w:t>
+      </w:r>
+      <w:r>
+        <w:t xml:space="preserve">its public licence is restricted to non-commercial academic use [13].</w:t>
+      </w:r>
+    </w:p>
+    <w:p>
+      <w:pPr>
+        <w:pStyle w:val="CaptionedFigure"/>
+      </w:pPr>
+      <w:r>
+        <w:drawing>
+          <wp:inline>
+            <wp:extent cx="5334000" cy="4582291"/>
+            <wp:effectExtent b="0" l="0" r="0" t="0"/>
+            <wp:docPr descr="Post-review robustness analyses. a, Contrast-weighted and equal-family method agreement; the point and whisker show the family-cluster bootstrap median and 95% interval. b, Leave-one-family- out agreement. c, Feature-coverage thresholds and the common-feature refit. d, Historical models and exploratory Pasta signs across eight source-labelled favourable families. Blue denotes a positive youth-oriented effect and orange a negative effect; signs provide redundant encoding." title="" id="36" name="Picture"/>
+            <a:graphic>
+              <a:graphicData uri="http://schemas.openxmlformats.org/drawingml/2006/picture">
+                <pic:pic>
+                  <pic:nvPicPr>
+                    <pic:cNvPr descr="figures/figure-5-post-review-robustness.png" id="37" name="Picture"/>
+                    <pic:cNvPicPr>
+                      <a:picLocks noChangeArrowheads="1" noChangeAspect="1"/>
+                    </pic:cNvPicPr>
+                  </pic:nvPicPr>
+                  <pic:blipFill>
+                    <a:blip r:embed="rId35"/>
+                    <a:stretch>
+                      <a:fillRect/>
+                    </a:stretch>
+                  </pic:blipFill>
+                  <pic:spPr bwMode="auto">
+                    <a:xfrm>
+                      <a:off x="0" y="0"/>
+                      <a:ext cx="5334000" cy="4582291"/>
+                    </a:xfrm>
+                    <a:prstGeom prst="rect">
+                      <a:avLst/>
+                    </a:prstGeom>
+                    <a:noFill/>
+                    <a:ln w="9525">
+                      <a:noFill/>
+                      <a:headEnd/>
+                      <a:tailEnd/>
+                    </a:ln>
+                  </pic:spPr>
+                </pic:pic>
+              </a:graphicData>
+            </a:graphic>
+          </wp:inline>
+        </w:drawing>
+      </w:r>
+    </w:p>
+    <w:p>
+      <w:pPr>
+        <w:pStyle w:val="ImageCaption"/>
+      </w:pPr>
+      <w:r>
+        <w:t xml:space="preserve">Post-review robustness analyses.</w:t>
+      </w:r>
+      <w:r>
+        <w:t xml:space="preserve"> </w:t>
+      </w:r>
+      <w:r>
+        <w:rPr>
+          <w:bCs/>
+          <w:b/>
+        </w:rPr>
+        <w:t xml:space="preserve">a,</w:t>
+      </w:r>
+      <w:r>
+        <w:t xml:space="preserve"> </w:t>
+      </w:r>
+      <w:r>
+        <w:t xml:space="preserve">Contrast-weighted and equal-family method agreement; the</w:t>
+      </w:r>
+      <w:r>
+        <w:t xml:space="preserve"> </w:t>
+      </w:r>
+      <w:r>
+        <w:t xml:space="preserve">point and whisker show the family-cluster bootstrap median and 95% interval.</w:t>
+      </w:r>
+      <w:r>
+        <w:t xml:space="preserve"> </w:t>
+      </w:r>
+      <w:r>
+        <w:rPr>
+          <w:bCs/>
+          <w:b/>
+        </w:rPr>
+        <w:t xml:space="preserve">b,</w:t>
+      </w:r>
+      <w:r>
+        <w:t xml:space="preserve"> </w:t>
+      </w:r>
+      <w:r>
+        <w:t xml:space="preserve">Leave-one-family-</w:t>
+      </w:r>
+      <w:r>
+        <w:t xml:space="preserve"> </w:t>
+      </w:r>
+      <w:r>
+        <w:t xml:space="preserve">out agreement.</w:t>
+      </w:r>
+      <w:r>
+        <w:t xml:space="preserve"> </w:t>
+      </w:r>
+      <w:r>
+        <w:rPr>
+          <w:bCs/>
+          <w:b/>
+        </w:rPr>
+        <w:t xml:space="preserve">c,</w:t>
+      </w:r>
+      <w:r>
+        <w:t xml:space="preserve"> </w:t>
+      </w:r>
+      <w:r>
+        <w:t xml:space="preserve">Feature-coverage thresholds and the common-feature refit.</w:t>
+      </w:r>
+      <w:r>
+        <w:t xml:space="preserve"> </w:t>
+      </w:r>
+      <w:r>
+        <w:rPr>
+          <w:bCs/>
+          <w:b/>
+        </w:rPr>
+        <w:t xml:space="preserve">d,</w:t>
+      </w:r>
+      <w:r>
+        <w:t xml:space="preserve"> </w:t>
+      </w:r>
+      <w:r>
+        <w:t xml:space="preserve">Historical</w:t>
+      </w:r>
+      <w:r>
+        <w:t xml:space="preserve"> </w:t>
+      </w:r>
+      <w:r>
+        <w:t xml:space="preserve">models and exploratory Pasta signs across eight source-labelled favourable families. Blue denotes a</w:t>
+      </w:r>
+      <w:r>
+        <w:t xml:space="preserve"> </w:t>
+      </w:r>
+      <w:r>
+        <w:t xml:space="preserve">positive youth-oriented effect and orange a negative effect; signs provide redundant encoding.</w:t>
+      </w:r>
+    </w:p>
+    <w:bookmarkEnd w:id="38"/>
+    <w:bookmarkEnd w:id="39"/>
+    <w:bookmarkStart w:id="40" w:name="discussion"/>
     <w:p>
       <w:pPr>
         <w:pStyle w:val="Heading1"/>
@@ -1722,37 +2143,37 @@
         <w:t xml:space="preserve"> </w:t>
       </w:r>
       <w:r>
-        <w:t xml:space="preserve">models can generalize across platforms and recover experimental perturbations [14]. Our study does</w:t>
-      </w:r>
-      <w:r>
-        <w:t xml:space="preserve"> </w:t>
-      </w:r>
-      <w:r>
-        <w:t xml:space="preserve">not benchmark those later systems head-to-head: their releases post-date our discovery cutoff and</w:t>
-      </w:r>
-      <w:r>
-        <w:t xml:space="preserve"> </w:t>
-      </w:r>
-      <w:r>
-        <w:t xml:space="preserve">their input and licence requirements were not substituted into a locked historical analysis. Rather,</w:t>
-      </w:r>
-      <w:r>
-        <w:t xml:space="preserve"> </w:t>
-      </w:r>
-      <w:r>
-        <w:t xml:space="preserve">we add a partial-reprogramming-specific stress test with temporally separated data, identity and</w:t>
-      </w:r>
-      <w:r>
-        <w:t xml:space="preserve"> </w:t>
-      </w:r>
-      <w:r>
-        <w:t xml:space="preserve">pluripotency axes, explicit adverse and target endpoints, preserved failures, and complete</w:t>
-      </w:r>
-      <w:r>
-        <w:t xml:space="preserve"> </w:t>
-      </w:r>
-      <w:r>
-        <w:t xml:space="preserve">method-by-contrast disclosure.</w:t>
+        <w:t xml:space="preserve">models can generalize across platforms and recover experimental perturbations [14]. Our exploratory</w:t>
+      </w:r>
+      <w:r>
+        <w:t xml:space="preserve"> </w:t>
+      </w:r>
+      <w:r>
+        <w:t xml:space="preserve">Pasta result shows that a stronger contemporary chronological model does not automatically resolve</w:t>
+      </w:r>
+      <w:r>
+        <w:t xml:space="preserve"> </w:t>
+      </w:r>
+      <w:r>
+        <w:t xml:space="preserve">the present portability problem, but one model cannot represent the full modern clock class. The</w:t>
+      </w:r>
+      <w:r>
+        <w:t xml:space="preserve"> </w:t>
+      </w:r>
+      <w:r>
+        <w:t xml:space="preserve">historical result and contemporary extension remain analytically separate. Our contribution is a</w:t>
+      </w:r>
+      <w:r>
+        <w:t xml:space="preserve"> </w:t>
+      </w:r>
+      <w:r>
+        <w:t xml:space="preserve">partial-reprogramming-specific stress test with temporally separated data, identity and pluripotency</w:t>
+      </w:r>
+      <w:r>
+        <w:t xml:space="preserve"> </w:t>
+      </w:r>
+      <w:r>
+        <w:t xml:space="preserve">axes, an adverse challenge, preserved failures and complete method-by-contrast disclosure.</w:t>
       </w:r>
     </w:p>
     <w:p>
@@ -1906,19 +2327,31 @@
         <w:t xml:space="preserve"> </w:t>
       </w:r>
       <w:r>
-        <w:t xml:space="preserve">decision rules rather than population hypothesis tests. Finally, newly published mortality- and</w:t>
-      </w:r>
-      <w:r>
-        <w:t xml:space="preserve"> </w:t>
-      </w:r>
-      <w:r>
-        <w:t xml:space="preserve">outcome-trained clocks should be evaluated in a prospectively locked future benchmark with compatible</w:t>
-      </w:r>
-      <w:r>
-        <w:t xml:space="preserve"> </w:t>
-      </w:r>
-      <w:r>
-        <w:t xml:space="preserve">inputs and rights.</w:t>
+        <w:t xml:space="preserve">engineering criteria rather than natural biological thresholds or population hypothesis tests. The</w:t>
+      </w:r>
+      <w:r>
+        <w:t xml:space="preserve"> </w:t>
+      </w:r>
+      <w:r>
+        <w:t xml:space="preserve">post-review analyses were outcome-aware, Pasta’s complete training-sample overlap could not be</w:t>
+      </w:r>
+      <w:r>
+        <w:t xml:space="preserve"> </w:t>
+      </w:r>
+      <w:r>
+        <w:t xml:space="preserve">audited from public materials, and the tAge licence did not permit inclusion under the present</w:t>
+      </w:r>
+      <w:r>
+        <w:t xml:space="preserve"> </w:t>
+      </w:r>
+      <w:r>
+        <w:t xml:space="preserve">commercial affiliation. Newly published mortality- and outcome-trained clocks should therefore be</w:t>
+      </w:r>
+      <w:r>
+        <w:t xml:space="preserve"> </w:t>
+      </w:r>
+      <w:r>
+        <w:t xml:space="preserve">evaluated in a prospectively locked future benchmark with compatible inputs and rights.</w:t>
       </w:r>
     </w:p>
     <w:p>
@@ -1944,17 +2377,29 @@
         <w:t xml:space="preserve"> </w:t>
       </w:r>
       <w:r>
-        <w:t xml:space="preserve">and orthogonal function are separately auditable. In the datasets assessed here, no universal scalar</w:t>
-      </w:r>
-      <w:r>
-        <w:t xml:space="preserve"> </w:t>
-      </w:r>
-      <w:r>
-        <w:t xml:space="preserve">transcriptomic rejuvenation direction survived that evaluation.</w:t>
-      </w:r>
-    </w:p>
-    <w:bookmarkEnd w:id="36"/>
-    <w:bookmarkStart w:id="45" w:name="methods"/>
+        <w:t xml:space="preserve">and orthogonal function are separately auditable. In the datasets assessed here, none of the five</w:t>
+      </w:r>
+      <w:r>
+        <w:t xml:space="preserve"> </w:t>
+      </w:r>
+      <w:r>
+        <w:t xml:space="preserve">historical directions met the locked portability criteria, and the exploratory Pasta model remained</w:t>
+      </w:r>
+      <w:r>
+        <w:t xml:space="preserve"> </w:t>
+      </w:r>
+      <w:r>
+        <w:t xml:space="preserve">split across favourable-labelled families. This does not establish that chronological transcriptomic</w:t>
+      </w:r>
+      <w:r>
+        <w:t xml:space="preserve"> </w:t>
+      </w:r>
+      <w:r>
+        <w:t xml:space="preserve">clocks can never measure an outcome-relevant component of rejuvenation.</w:t>
+      </w:r>
+    </w:p>
+    <w:bookmarkEnd w:id="40"/>
+    <w:bookmarkStart w:id="50" w:name="methods"/>
     <w:p>
       <w:pPr>
         <w:pStyle w:val="Heading1"/>
@@ -1963,7 +2408,7 @@
         <w:t xml:space="preserve">Methods</w:t>
       </w:r>
     </w:p>
-    <w:bookmarkStart w:id="37" w:name="study-design-and-temporal-firewall"/>
+    <w:bookmarkStart w:id="41" w:name="study-design-and-temporal-firewall"/>
     <w:p>
       <w:pPr>
         <w:pStyle w:val="Heading2"/>
@@ -2066,8 +2511,34 @@
         <w:t xml:space="preserve">does not mean prospective or blinded.</w:t>
       </w:r>
     </w:p>
-    <w:bookmarkEnd w:id="37"/>
-    <w:bookmarkStart w:id="38" w:name="expression-representation-and-orthology"/>
+    <w:p>
+      <w:pPr>
+        <w:pStyle w:val="BodyText"/>
+      </w:pPr>
+      <w:r>
+        <w:t xml:space="preserve">Reviewer-requested Extension C1 was locked before its outcomes were computed. It prespecified family</w:t>
+      </w:r>
+      <w:r>
+        <w:t xml:space="preserve"> </w:t>
+      </w:r>
+      <w:r>
+        <w:t xml:space="preserve">weighting, cluster bootstrap, leave-one-family-out, threshold, stratum, reliability and feature-</w:t>
+      </w:r>
+      <w:r>
+        <w:t xml:space="preserve"> </w:t>
+      </w:r>
+      <w:r>
+        <w:t xml:space="preserve">coverage analyses, plus one contemporary comparator. C1 is explicitly post-review and outcome-aware;</w:t>
+      </w:r>
+      <w:r>
+        <w:t xml:space="preserve"> </w:t>
+      </w:r>
+      <w:r>
+        <w:t xml:space="preserve">it tests robustness but does not retroactively alter or rescue B1.</w:t>
+      </w:r>
+    </w:p>
+    <w:bookmarkEnd w:id="41"/>
+    <w:bookmarkStart w:id="42" w:name="expression-representation-and-orthology"/>
     <w:p>
       <w:pPr>
         <w:pStyle w:val="Heading2"/>
@@ -2123,11 +2594,17 @@
         <w:t xml:space="preserve"> </w:t>
       </w:r>
       <w:r>
-        <w:t xml:space="preserve">means.</w:t>
-      </w:r>
-    </w:p>
-    <w:bookmarkEnd w:id="38"/>
-    <w:bookmarkStart w:id="39" w:name="construction-of-y_a1"/>
+        <w:t xml:space="preserve">means. C1 reported actual coverage for every matrix, repeated eligibility at 70%, 80% and 90%, and</w:t>
+      </w:r>
+      <w:r>
+        <w:t xml:space="preserve"> </w:t>
+      </w:r>
+      <w:r>
+        <w:t xml:space="preserve">refitted the historical models on the 8,427-feature intersection shared by all benchmark matrices.</w:t>
+      </w:r>
+    </w:p>
+    <w:bookmarkEnd w:id="42"/>
+    <w:bookmarkStart w:id="43" w:name="construction-of-y_a1"/>
     <w:p>
       <w:pPr>
         <w:pStyle w:val="Heading2"/>
@@ -2228,8 +2705,8 @@
         <w:t xml:space="preserve">dimensionless and were never converted to years.</w:t>
       </w:r>
     </w:p>
-    <w:bookmarkEnd w:id="39"/>
-    <w:bookmarkStart w:id="40" w:name="identity-pluripotency-and-damage-axes"/>
+    <w:bookmarkEnd w:id="43"/>
+    <w:bookmarkStart w:id="44" w:name="identity-pluripotency-and-damage-axes"/>
     <w:p>
       <w:pPr>
         <w:pStyle w:val="Heading2"/>
@@ -2359,8 +2836,8 @@
         <w:t xml:space="preserve">components. Programme coverage required at least 15 genes and 50% of the frozen set.</w:t>
       </w:r>
     </w:p>
-    <w:bookmarkEnd w:id="40"/>
-    <w:bookmarkStart w:id="41" w:name="X9837de37ae726ff05092cf80d4970cd2bbca87d"/>
+    <w:bookmarkEnd w:id="44"/>
+    <w:bookmarkStart w:id="45" w:name="X9837de37ae726ff05092cf80d4970cd2bbca87d"/>
     <w:p>
       <w:pPr>
         <w:pStyle w:val="Heading2"/>
@@ -2505,8 +2982,8 @@
         <w:t xml:space="preserve">+0.05.</w:t>
       </w:r>
     </w:p>
-    <w:bookmarkEnd w:id="41"/>
-    <w:bookmarkStart w:id="42" w:name="candidate-ranking-and-matched-null"/>
+    <w:bookmarkEnd w:id="45"/>
+    <w:bookmarkStart w:id="46" w:name="candidate-ranking-and-matched-null"/>
     <w:p>
       <w:pPr>
         <w:pStyle w:val="Heading2"/>
@@ -2552,9 +3029,21 @@
       <w:r>
         <w:t xml:space="preserve">expression deciles (seed 271828). Missing targets were reported and not replaced.</w:t>
       </w:r>
-    </w:p>
-    <w:bookmarkEnd w:id="42"/>
-    <w:bookmarkStart w:id="43" w:name="adaptive-benchmark-b1"/>
+      <w:r>
+        <w:t xml:space="preserve"> </w:t>
+      </w:r>
+      <w:r>
+        <w:t xml:space="preserve">This underpowered three-of-five evaluable analysis was treated as secondary corroboration, not as a</w:t>
+      </w:r>
+      <w:r>
+        <w:t xml:space="preserve"> </w:t>
+      </w:r>
+      <w:r>
+        <w:t xml:space="preserve">major basis for the portability conclusion.</w:t>
+      </w:r>
+    </w:p>
+    <w:bookmarkEnd w:id="46"/>
+    <w:bookmarkStart w:id="47" w:name="adaptive-benchmark-b1"/>
     <w:p>
       <w:pPr>
         <w:pStyle w:val="Heading2"/>
@@ -2799,13 +3288,131 @@
         <w:t xml:space="preserve">seven. Genes were not treated as biological replicates.</w:t>
       </w:r>
     </w:p>
-    <w:bookmarkEnd w:id="43"/>
-    <w:bookmarkStart w:id="44" w:name="software-and-reproducibility"/>
+    <w:bookmarkEnd w:id="47"/>
+    <w:bookmarkStart w:id="48" w:name="post-review-extension-c1"/>
     <w:p>
       <w:pPr>
         <w:pStyle w:val="Heading2"/>
       </w:pPr>
       <w:r>
+        <w:t xml:space="preserve">Post-review Extension C1</w:t>
+      </w:r>
+    </w:p>
+    <w:p>
+      <w:pPr>
+        <w:pStyle w:val="FirstParagraph"/>
+      </w:pPr>
+      <w:r>
+        <w:t xml:space="preserve">For each method pair, sign agreement was first computed within each of the 14 benchmark families and</w:t>
+      </w:r>
+      <w:r>
+        <w:t xml:space="preserve"> </w:t>
+      </w:r>
+      <w:r>
+        <w:t xml:space="preserve">then averaged across families; the reported statistic is the median across ten method pairs. The</w:t>
+      </w:r>
+      <w:r>
+        <w:t xml:space="preserve"> </w:t>
+      </w:r>
+      <w:r>
+        <w:t xml:space="preserve">cluster bootstrap resampled 14 families with replacement 10,000 times (seed 3092026). The</w:t>
+      </w:r>
+      <w:r>
+        <w:t xml:space="preserve"> </w:t>
+      </w:r>
+      <w:r>
+        <w:t xml:space="preserve">leave-one-family-out analysis recomputed the equal-family statistic after omitting each family. Gate</w:t>
+      </w:r>
+      <w:r>
+        <w:t xml:space="preserve"> </w:t>
+      </w:r>
+      <w:r>
+        <w:t xml:space="preserve">sensitivity evaluated agreement thresholds from 0.50 to 1.00 in increments of 0.025 and favourable-</w:t>
+      </w:r>
+      <w:r>
+        <w:t xml:space="preserve"> </w:t>
+      </w:r>
+      <w:r>
+        <w:t xml:space="preserve">family requirements from four to eight of eight.</w:t>
+      </w:r>
+    </w:p>
+    <w:p>
+      <w:pPr>
+        <w:pStyle w:val="BodyText"/>
+      </w:pPr>
+      <w:r>
+        <w:t xml:space="preserve">Strata were fixed by species, intervention class and cellular context. Split-half reliability used</w:t>
+      </w:r>
+      <w:r>
+        <w:t xml:space="preserve"> </w:t>
+      </w:r>
+      <w:r>
+        <w:t xml:space="preserve">balanced partitions of contrast units for families with at least four units. Where both treatment</w:t>
+      </w:r>
+      <w:r>
+        <w:t xml:space="preserve"> </w:t>
+      </w:r>
+      <w:r>
+        <w:t xml:space="preserve">and control contained at least two biological units, a separate arm-split analysis reconstructed two</w:t>
+      </w:r>
+      <w:r>
+        <w:t xml:space="preserve"> </w:t>
+      </w:r>
+      <w:r>
+        <w:t xml:space="preserve">independent effect vectors. Spearman–Brown values were recorded, but the manuscript reports raw</w:t>
+      </w:r>
+      <w:r>
+        <w:t xml:space="preserve"> </w:t>
+      </w:r>
+      <w:r>
+        <w:t xml:space="preserve">split-half correlations to avoid implying full-study reliability.</w:t>
+      </w:r>
+    </w:p>
+    <w:p>
+      <w:pPr>
+        <w:pStyle w:val="BodyText"/>
+      </w:pPr>
+      <w:r>
+        <w:t xml:space="preserve">Pasta was reconstructed from the authors’ MIT-licensed model package at commit</w:t>
+      </w:r>
+      <w:r>
+        <w:t xml:space="preserve"> </w:t>
+      </w:r>
+      <w:r>
+        <w:rPr>
+          <w:rStyle w:val="VerbatimChar"/>
+        </w:rPr>
+        <w:t xml:space="preserve">58bcc7a69ee97f2dc9e3623ac86538c251ddd498</w:t>
+      </w:r>
+      <w:r>
+        <w:t xml:space="preserve">, using its 8,113-gene list, median imputation,</w:t>
+      </w:r>
+      <w:r>
+        <w:t xml:space="preserve"> </w:t>
+      </w:r>
+      <w:r>
+        <w:t xml:space="preserve">within-sample ranks and frozen ridge coefficients [14]. Age-shift predictions were sign-reversed so</w:t>
+      </w:r>
+      <w:r>
+        <w:t xml:space="preserve"> </w:t>
+      </w:r>
+      <w:r>
+        <w:t xml:space="preserve">that positive values denote a youth-associated direction. Package files and their SHA-256 hashes,</w:t>
+      </w:r>
+      <w:r>
+        <w:t xml:space="preserve"> </w:t>
+      </w:r>
+      <w:r>
+        <w:t xml:space="preserve">implementation validation and the licensing decision for tAge are recorded in the release audit.</w:t>
+      </w:r>
+    </w:p>
+    <w:bookmarkEnd w:id="48"/>
+    <w:bookmarkStart w:id="49" w:name="software-and-reproducibility"/>
+    <w:p>
+      <w:pPr>
+        <w:pStyle w:val="Heading2"/>
+      </w:pPr>
+      <w:r>
         <w:t xml:space="preserve">Software and reproducibility</w:t>
       </w:r>
     </w:p>
@@ -2814,13 +3421,13 @@
         <w:pStyle w:val="FirstParagraph"/>
       </w:pPr>
       <w:r>
-        <w:t xml:space="preserve">Analyses used Python 3.12 with NumPy, pandas, SciPy, scikit-learn, h5py, anndata, matplotlib and</w:t>
-      </w:r>
-      <w:r>
-        <w:t xml:space="preserve"> </w:t>
-      </w:r>
-      <w:r>
-        <w:t xml:space="preserve">seaborn in a frozen local environment. All stochastic procedures used recorded seeds. Tests cover</w:t>
+        <w:t xml:space="preserve">Analyses used Python 3.12 with NumPy, pandas, SciPy, scikit-learn, h5py, anndata, rdata, matplotlib</w:t>
+      </w:r>
+      <w:r>
+        <w:t xml:space="preserve"> </w:t>
+      </w:r>
+      <w:r>
+        <w:t xml:space="preserve">and seaborn in a frozen local environment. All stochastic procedures used recorded seeds. Tests cover</w:t>
       </w:r>
       <w:r>
         <w:t xml:space="preserve"> </w:t>
@@ -2847,9 +3454,9 @@
         <w:t xml:space="preserve">participant-linked records.</w:t>
       </w:r>
     </w:p>
-    <w:bookmarkEnd w:id="44"/>
-    <w:bookmarkEnd w:id="45"/>
-    <w:bookmarkStart w:id="47" w:name="data-availability"/>
+    <w:bookmarkEnd w:id="49"/>
+    <w:bookmarkEnd w:id="50"/>
+    <w:bookmarkStart w:id="52" w:name="data-availability"/>
     <w:p>
       <w:pPr>
         <w:pStyle w:val="Heading1"/>
@@ -2875,12 +3482,12 @@
         <w:t xml:space="preserve"> </w:t>
       </w:r>
       <w:r>
-        <w:t xml:space="preserve">The reviewed manuscript repository is prepared for public release at</w:t>
-      </w:r>
-      <w:r>
-        <w:t xml:space="preserve"> </w:t>
-      </w:r>
-      <w:hyperlink r:id="rId46">
+        <w:t xml:space="preserve">The reviewed manuscript repository will be made publicly available at</w:t>
+      </w:r>
+      <w:r>
+        <w:t xml:space="preserve"> </w:t>
+      </w:r>
+      <w:hyperlink r:id="rId51">
         <w:r>
           <w:rPr>
             <w:rStyle w:val="Hyperlink"/>
@@ -2889,17 +3496,30 @@
         </w:r>
       </w:hyperlink>
       <w:r>
-        <w:t xml:space="preserve">. The immutable archival DOI</w:t>
-      </w:r>
-      <w:r>
-        <w:t xml:space="preserve"> </w:t>
-      </w:r>
-      <w:r>
-        <w:t xml:space="preserve">will be added to the public record when the approved release is deposited.</w:t>
-      </w:r>
-    </w:p>
-    <w:bookmarkEnd w:id="47"/>
-    <w:bookmarkStart w:id="48" w:name="code-availability"/>
+        <w:t xml:space="preserve">. The immutable archival</w:t>
+      </w:r>
+      <w:r>
+        <w:t xml:space="preserve"> </w:t>
+      </w:r>
+      <w:r>
+        <w:t xml:space="preserve">DOI will be inserted before submission:</w:t>
+      </w:r>
+      <w:r>
+        <w:t xml:space="preserve"> </w:t>
+      </w:r>
+      <w:r>
+        <w:rPr>
+          <w:bCs/>
+          <w:b/>
+        </w:rPr>
+        <w:t xml:space="preserve">[ZENODO DOI — REQUIRED BEFORE SUBMISSION]</w:t>
+      </w:r>
+      <w:r>
+        <w:t xml:space="preserve">.</w:t>
+      </w:r>
+    </w:p>
+    <w:bookmarkEnd w:id="52"/>
+    <w:bookmarkStart w:id="53" w:name="code-availability"/>
     <w:p>
       <w:pPr>
         <w:pStyle w:val="Heading1"/>
@@ -2913,18 +3533,18 @@
         <w:pStyle w:val="FirstParagraph"/>
       </w:pPr>
       <w:r>
-        <w:t xml:space="preserve">The complete analysis and figure code, frozen configurations, tests and aggregate result tables are</w:t>
-      </w:r>
-      <w:r>
-        <w:t xml:space="preserve"> </w:t>
-      </w:r>
-      <w:r>
-        <w:t xml:space="preserve">prepared for public release at</w:t>
-      </w:r>
-      <w:r>
-        <w:t xml:space="preserve"> </w:t>
-      </w:r>
-      <w:hyperlink r:id="rId46">
+        <w:t xml:space="preserve">The complete analysis and figure code, frozen configurations, tests and aggregate result tables will</w:t>
+      </w:r>
+      <w:r>
+        <w:t xml:space="preserve"> </w:t>
+      </w:r>
+      <w:r>
+        <w:t xml:space="preserve">be made publicly available at</w:t>
+      </w:r>
+      <w:r>
+        <w:t xml:space="preserve"> </w:t>
+      </w:r>
+      <w:hyperlink r:id="rId51">
         <w:r>
           <w:rPr>
             <w:rStyle w:val="Hyperlink"/>
@@ -2948,8 +3568,8 @@
         <w:t xml:space="preserve">feature or to rank targets.</w:t>
       </w:r>
     </w:p>
-    <w:bookmarkEnd w:id="48"/>
-    <w:bookmarkStart w:id="49" w:name="acknowledgements"/>
+    <w:bookmarkEnd w:id="53"/>
+    <w:bookmarkStart w:id="54" w:name="acknowledgements"/>
     <w:p>
       <w:pPr>
         <w:pStyle w:val="Heading1"/>
@@ -2983,7 +3603,7 @@
         <w:t xml:space="preserve"> </w:t>
       </w:r>
       <w:r>
-        <w:t xml:space="preserve">literature organization and manuscript drafting. The author inspected the source data, code,</w:t>
+        <w:t xml:space="preserve">literature organization and manuscript drafting. The authors inspected the source data, code,</w:t>
       </w:r>
       <w:r>
         <w:t xml:space="preserve"> </w:t>
@@ -2998,8 +3618,8 @@
         <w:t xml:space="preserve">conclusions.</w:t>
       </w:r>
     </w:p>
-    <w:bookmarkEnd w:id="49"/>
-    <w:bookmarkStart w:id="50" w:name="author-contributions"/>
+    <w:bookmarkEnd w:id="54"/>
+    <w:bookmarkStart w:id="55" w:name="author-contributions"/>
     <w:p>
       <w:pPr>
         <w:pStyle w:val="Heading1"/>
@@ -3040,8 +3660,8 @@
         <w:t xml:space="preserve">&amp; editing.</w:t>
       </w:r>
     </w:p>
-    <w:bookmarkEnd w:id="50"/>
-    <w:bookmarkStart w:id="51" w:name="competing-interests"/>
+    <w:bookmarkEnd w:id="55"/>
+    <w:bookmarkStart w:id="56" w:name="competing-interests"/>
     <w:p>
       <w:pPr>
         <w:pStyle w:val="Heading1"/>
@@ -3070,8 +3690,8 @@
         <w:t xml:space="preserve">publication of this work. The author declares no other competing interests.</w:t>
       </w:r>
     </w:p>
-    <w:bookmarkEnd w:id="51"/>
-    <w:bookmarkStart w:id="52" w:name="ethics-statement"/>
+    <w:bookmarkEnd w:id="56"/>
+    <w:bookmarkStart w:id="57" w:name="ethics-statement"/>
     <w:p>
       <w:pPr>
         <w:pStyle w:val="Heading1"/>
@@ -3100,8 +3720,8 @@
         <w:t xml:space="preserve">collection.</w:t>
       </w:r>
     </w:p>
-    <w:bookmarkEnd w:id="52"/>
-    <w:bookmarkStart w:id="53" w:name="references"/>
+    <w:bookmarkEnd w:id="57"/>
+    <w:bookmarkStart w:id="58" w:name="references"/>
     <w:p>
       <w:pPr>
         <w:pStyle w:val="Heading1"/>
@@ -4042,7 +4662,7 @@
         <w:t xml:space="preserve">, btae200 (2024). https://doi.org/10.1093/bioinformatics/btae200</w:t>
       </w:r>
     </w:p>
-    <w:bookmarkEnd w:id="53"/>
+    <w:bookmarkEnd w:id="58"/>
     <w:sectPr/>
   </w:body>
 </w:document>

</xml_diff>

<commit_message>
Improve manuscript figures and AI disclosure
</commit_message>
<xml_diff>
--- a/paper/manuscript.docx
+++ b/paper/manuscript.docx
@@ -498,7 +498,7 @@
       <w:r>
         <w:drawing>
           <wp:inline>
-            <wp:extent cx="5334000" cy="4424292"/>
+            <wp:extent cx="5334000" cy="3847028"/>
             <wp:effectExtent b="0" l="0" r="0" t="0"/>
             <wp:docPr descr="Study design and qualification logic. a, Discovery, locking, temporal validation and the post-primary benchmark. b, The four frozen state axes. c, The qualification ladder used for interpretation." title="" id="21" name="Picture"/>
             <a:graphic>
@@ -519,7 +519,7 @@
                   <pic:spPr bwMode="auto">
                     <a:xfrm>
                       <a:off x="0" y="0"/>
-                      <a:ext cx="5334000" cy="4424292"/>
+                      <a:ext cx="5334000" cy="3847028"/>
                     </a:xfrm>
                     <a:prstGeom prst="rect">
                       <a:avLst/>
@@ -1016,7 +1016,7 @@
       <w:r>
         <w:drawing>
           <wp:inline>
-            <wp:extent cx="5334000" cy="5175192"/>
+            <wp:extent cx="5334000" cy="5176404"/>
             <wp:effectExtent b="0" l="0" r="0" t="0"/>
             <wp:docPr descr="Frozen framework results. a, Held-out age association in the two reference cohorts. b, Complete primary scorecard. c, Human 2c/7c effects by donor line and day. d, Old-donor OSKM trajectory for the youth, identity and endogenous pluripotency axes." title="" id="24" name="Picture"/>
             <a:graphic>
@@ -1037,7 +1037,7 @@
                   <pic:spPr bwMode="auto">
                     <a:xfrm>
                       <a:off x="0" y="0"/>
-                      <a:ext cx="5334000" cy="5175192"/>
+                      <a:ext cx="5334000" cy="5176404"/>
                     </a:xfrm>
                     <a:prstGeom prst="rect">
                       <a:avLst/>
@@ -1305,7 +1305,25 @@
         <w:t xml:space="preserve"> </w:t>
       </w:r>
       <w:r>
-        <w:t xml:space="preserve">summary.</w:t>
+        <w:t xml:space="preserve">summary. Neither estimate indicates random or complete discordance: the five models retained a</w:t>
+      </w:r>
+      <w:r>
+        <w:t xml:space="preserve"> </w:t>
+      </w:r>
+      <w:r>
+        <w:t xml:space="preserve">meaningful shared directional component. The qualification failure is narrower—agreement was</w:t>
+      </w:r>
+      <w:r>
+        <w:t xml:space="preserve"> </w:t>
+      </w:r>
+      <w:r>
+        <w:t xml:space="preserve">insufficient for the models to serve as interchangeable or universal scalar readouts under the</w:t>
+      </w:r>
+      <w:r>
+        <w:t xml:space="preserve"> </w:t>
+      </w:r>
+      <w:r>
+        <w:t xml:space="preserve">locked criterion.</w:t>
       </w:r>
     </w:p>
     <w:p>
@@ -1682,9 +1700,9 @@
       <w:r>
         <w:drawing>
           <wp:inline>
-            <wp:extent cx="5334000" cy="4585881"/>
+            <wp:extent cx="5334000" cy="4584983"/>
             <wp:effectExtent b="0" l="0" r="0" t="0"/>
-            <wp:docPr descr="Cross-method and cross-family concordance. a, Pairwise method sign agreement across 184 contrasts. b, Spearman correlations between family-mean gene effects. c, Leave-one-family-out consensus correlations. d, Supported and unsupported interpretation." title="" id="32" name="Picture"/>
+            <wp:docPr descr="Cross-method and cross-family concordance. a, Pairwise method sign agreement across 184 contrasts. b, Spearman correlations between family-mean gene effects. c, Leave-one-family-out consensus correlations. d, Raw within-family and within-contrast split-half reliability compared with the cross-family median gene-effect correlation." title="" id="32" name="Picture"/>
             <a:graphic>
               <a:graphicData uri="http://schemas.openxmlformats.org/drawingml/2006/picture">
                 <pic:pic>
@@ -1703,7 +1721,7 @@
                   <pic:spPr bwMode="auto">
                     <a:xfrm>
                       <a:off x="0" y="0"/>
-                      <a:ext cx="5334000" cy="4585881"/>
+                      <a:ext cx="5334000" cy="4584983"/>
                     </a:xfrm>
                     <a:prstGeom prst="rect">
                       <a:avLst/>
@@ -1803,7 +1821,13 @@
         <w:t xml:space="preserve"> </w:t>
       </w:r>
       <w:r>
-        <w:t xml:space="preserve">Supported and unsupported interpretation.</w:t>
+        <w:t xml:space="preserve">Raw within-family and within-contrast split-half reliability compared</w:t>
+      </w:r>
+      <w:r>
+        <w:t xml:space="preserve"> </w:t>
+      </w:r>
+      <w:r>
+        <w:t xml:space="preserve">with the cross-family median gene-effect correlation.</w:t>
       </w:r>
     </w:p>
     <w:bookmarkEnd w:id="34"/>
@@ -1937,7 +1961,7 @@
           <wp:inline>
             <wp:extent cx="5334000" cy="4582291"/>
             <wp:effectExtent b="0" l="0" r="0" t="0"/>
-            <wp:docPr descr="Post-review robustness analyses. a, Contrast-weighted and equal-family method agreement; the point and whisker show the family-cluster bootstrap median and 95% interval. b, Leave-one-family- out agreement. c, Feature-coverage thresholds and the common-feature refit. d, Historical models and exploratory Pasta signs across eight source-labelled favourable families. Blue denotes a positive youth-oriented effect and orange a negative effect; signs provide redundant encoding." title="" id="36" name="Picture"/>
+            <wp:docPr descr="Post-review robustness analyses. a, Observed contrast-weighted and equal-family method agreement; the whisker shows the family-cluster bootstrap 95% interval around its median. b, Leave-one-family-out agreement. c, Feature-coverage thresholds and the separately displayed common-feature refit. d, Historical models and exploratory Pasta signs across eight source-labelled favourable families. Blue denotes a positive youth-oriented effect and orange a negative effect; signs provide redundant encoding." title="" id="36" name="Picture"/>
             <a:graphic>
               <a:graphicData uri="http://schemas.openxmlformats.org/drawingml/2006/picture">
                 <pic:pic>
@@ -1996,13 +2020,13 @@
         <w:t xml:space="preserve"> </w:t>
       </w:r>
       <w:r>
-        <w:t xml:space="preserve">Contrast-weighted and equal-family method agreement; the</w:t>
-      </w:r>
-      <w:r>
-        <w:t xml:space="preserve"> </w:t>
-      </w:r>
-      <w:r>
-        <w:t xml:space="preserve">point and whisker show the family-cluster bootstrap median and 95% interval.</w:t>
+        <w:t xml:space="preserve">Observed contrast-weighted and equal-family method</w:t>
+      </w:r>
+      <w:r>
+        <w:t xml:space="preserve"> </w:t>
+      </w:r>
+      <w:r>
+        <w:t xml:space="preserve">agreement; the whisker shows the family-cluster bootstrap 95% interval around its median.</w:t>
       </w:r>
       <w:r>
         <w:t xml:space="preserve"> </w:t>
@@ -2018,13 +2042,7 @@
         <w:t xml:space="preserve"> </w:t>
       </w:r>
       <w:r>
-        <w:t xml:space="preserve">Leave-one-family-</w:t>
-      </w:r>
-      <w:r>
-        <w:t xml:space="preserve"> </w:t>
-      </w:r>
-      <w:r>
-        <w:t xml:space="preserve">out agreement.</w:t>
+        <w:t xml:space="preserve">Leave-one-family-out agreement.</w:t>
       </w:r>
       <w:r>
         <w:t xml:space="preserve"> </w:t>
@@ -2040,7 +2058,13 @@
         <w:t xml:space="preserve"> </w:t>
       </w:r>
       <w:r>
-        <w:t xml:space="preserve">Feature-coverage thresholds and the common-feature refit.</w:t>
+        <w:t xml:space="preserve">Feature-coverage thresholds and the separately displayed</w:t>
+      </w:r>
+      <w:r>
+        <w:t xml:space="preserve"> </w:t>
+      </w:r>
+      <w:r>
+        <w:t xml:space="preserve">common-feature refit.</w:t>
       </w:r>
       <w:r>
         <w:t xml:space="preserve"> </w:t>
@@ -2111,7 +2135,19 @@
         <w:t xml:space="preserve"> </w:t>
       </w:r>
       <w:r>
-        <w:t xml:space="preserve">measurement are different validation problems.</w:t>
+        <w:t xml:space="preserve">measurement are different validation problems. The observed agreement is substantial rather than</w:t>
+      </w:r>
+      <w:r>
+        <w:t xml:space="preserve"> </w:t>
+      </w:r>
+      <w:r>
+        <w:t xml:space="preserve">negligible, supporting a shared component across models; the remaining context dependence prevents</w:t>
+      </w:r>
+      <w:r>
+        <w:t xml:space="preserve"> </w:t>
+      </w:r>
+      <w:r>
+        <w:t xml:space="preserve">that component from being interpreted as a universally stable rejuvenation direction.</w:t>
       </w:r>
     </w:p>
     <w:p>
@@ -2399,7 +2435,7 @@
       </w:r>
     </w:p>
     <w:bookmarkEnd w:id="40"/>
-    <w:bookmarkStart w:id="50" w:name="methods"/>
+    <w:bookmarkStart w:id="51" w:name="methods"/>
     <w:p>
       <w:pPr>
         <w:pStyle w:val="Heading1"/>
@@ -3407,12 +3443,54 @@
       </w:r>
     </w:p>
     <w:bookmarkEnd w:id="48"/>
-    <w:bookmarkStart w:id="49" w:name="software-and-reproducibility"/>
+    <w:bookmarkStart w:id="49" w:name="ai-assisted-research-and-writing"/>
     <w:p>
       <w:pPr>
         <w:pStyle w:val="Heading2"/>
       </w:pPr>
       <w:r>
+        <w:t xml:space="preserve">AI-assisted research and writing</w:t>
+      </w:r>
+    </w:p>
+    <w:p>
+      <w:pPr>
+        <w:pStyle w:val="FirstParagraph"/>
+      </w:pPr>
+      <w:r>
+        <w:t xml:space="preserve">OpenAI Codex was used under the author’s direction for code drafting, analysis orchestration,</w:t>
+      </w:r>
+      <w:r>
+        <w:t xml:space="preserve"> </w:t>
+      </w:r>
+      <w:r>
+        <w:t xml:space="preserve">literature organization and manuscript-language development. The author defined the scientific</w:t>
+      </w:r>
+      <w:r>
+        <w:t xml:space="preserve"> </w:t>
+      </w:r>
+      <w:r>
+        <w:t xml:space="preserve">questions and claim boundaries, reviewed the analysis code and outputs, verified citations and</w:t>
+      </w:r>
+      <w:r>
+        <w:t xml:space="preserve"> </w:t>
+      </w:r>
+      <w:r>
+        <w:t xml:space="preserve">numerical claims, revised the manuscript and accepts full responsibility for its content. AI systems</w:t>
+      </w:r>
+      <w:r>
+        <w:t xml:space="preserve"> </w:t>
+      </w:r>
+      <w:r>
+        <w:t xml:space="preserve">were not treated as authors or independent sources of evidence.</w:t>
+      </w:r>
+    </w:p>
+    <w:bookmarkEnd w:id="49"/>
+    <w:bookmarkStart w:id="50" w:name="software-and-reproducibility"/>
+    <w:p>
+      <w:pPr>
+        <w:pStyle w:val="Heading2"/>
+      </w:pPr>
+      <w:r>
         <w:t xml:space="preserve">Software and reproducibility</w:t>
       </w:r>
     </w:p>
@@ -3454,9 +3532,9 @@
         <w:t xml:space="preserve">participant-linked records.</w:t>
       </w:r>
     </w:p>
-    <w:bookmarkEnd w:id="49"/>
     <w:bookmarkEnd w:id="50"/>
-    <w:bookmarkStart w:id="52" w:name="data-availability"/>
+    <w:bookmarkEnd w:id="51"/>
+    <w:bookmarkStart w:id="53" w:name="data-availability"/>
     <w:p>
       <w:pPr>
         <w:pStyle w:val="Heading1"/>
@@ -3487,7 +3565,7 @@
       <w:r>
         <w:t xml:space="preserve"> </w:t>
       </w:r>
-      <w:hyperlink r:id="rId51">
+      <w:hyperlink r:id="rId52">
         <w:r>
           <w:rPr>
             <w:rStyle w:val="Hyperlink"/>
@@ -3518,8 +3596,8 @@
         <w:t xml:space="preserve">.</w:t>
       </w:r>
     </w:p>
-    <w:bookmarkEnd w:id="52"/>
-    <w:bookmarkStart w:id="53" w:name="code-availability"/>
+    <w:bookmarkEnd w:id="53"/>
+    <w:bookmarkStart w:id="54" w:name="code-availability"/>
     <w:p>
       <w:pPr>
         <w:pStyle w:val="Heading1"/>
@@ -3544,7 +3622,7 @@
       <w:r>
         <w:t xml:space="preserve"> </w:t>
       </w:r>
-      <w:hyperlink r:id="rId51">
+      <w:hyperlink r:id="rId52">
         <w:r>
           <w:rPr>
             <w:rStyle w:val="Hyperlink"/>
@@ -3568,8 +3646,8 @@
         <w:t xml:space="preserve">feature or to rank targets.</w:t>
       </w:r>
     </w:p>
-    <w:bookmarkEnd w:id="53"/>
-    <w:bookmarkStart w:id="54" w:name="acknowledgements"/>
+    <w:bookmarkEnd w:id="54"/>
+    <w:bookmarkStart w:id="55" w:name="acknowledgements"/>
     <w:p>
       <w:pPr>
         <w:pStyle w:val="Heading1"/>
@@ -3592,34 +3670,8 @@
         <w:t xml:space="preserve">Inc.</w:t>
       </w:r>
     </w:p>
-    <w:p>
-      <w:pPr>
-        <w:pStyle w:val="BodyText"/>
-      </w:pPr>
-      <w:r>
-        <w:t xml:space="preserve">OpenAI Codex was used under human direction to assist with code drafting, analysis orchestration,</w:t>
-      </w:r>
-      <w:r>
-        <w:t xml:space="preserve"> </w:t>
-      </w:r>
-      <w:r>
-        <w:t xml:space="preserve">literature organization and manuscript drafting. The authors inspected the source data, code,</w:t>
-      </w:r>
-      <w:r>
-        <w:t xml:space="preserve"> </w:t>
-      </w:r>
-      <w:r>
-        <w:t xml:space="preserve">computations, citations, figures and claims and retain full responsibility for the work and its</w:t>
-      </w:r>
-      <w:r>
-        <w:t xml:space="preserve"> </w:t>
-      </w:r>
-      <w:r>
-        <w:t xml:space="preserve">conclusions.</w:t>
-      </w:r>
-    </w:p>
-    <w:bookmarkEnd w:id="54"/>
-    <w:bookmarkStart w:id="55" w:name="author-contributions"/>
+    <w:bookmarkEnd w:id="55"/>
+    <w:bookmarkStart w:id="56" w:name="author-contributions"/>
     <w:p>
       <w:pPr>
         <w:pStyle w:val="Heading1"/>
@@ -3660,8 +3712,8 @@
         <w:t xml:space="preserve">&amp; editing.</w:t>
       </w:r>
     </w:p>
-    <w:bookmarkEnd w:id="55"/>
-    <w:bookmarkStart w:id="56" w:name="competing-interests"/>
+    <w:bookmarkEnd w:id="56"/>
+    <w:bookmarkStart w:id="57" w:name="competing-interests"/>
     <w:p>
       <w:pPr>
         <w:pStyle w:val="Heading1"/>
@@ -3690,8 +3742,8 @@
         <w:t xml:space="preserve">publication of this work. The author declares no other competing interests.</w:t>
       </w:r>
     </w:p>
-    <w:bookmarkEnd w:id="56"/>
-    <w:bookmarkStart w:id="57" w:name="ethics-statement"/>
+    <w:bookmarkEnd w:id="57"/>
+    <w:bookmarkStart w:id="58" w:name="ethics-statement"/>
     <w:p>
       <w:pPr>
         <w:pStyle w:val="Heading1"/>
@@ -3720,8 +3772,8 @@
         <w:t xml:space="preserve">collection.</w:t>
       </w:r>
     </w:p>
-    <w:bookmarkEnd w:id="57"/>
-    <w:bookmarkStart w:id="58" w:name="references"/>
+    <w:bookmarkEnd w:id="58"/>
+    <w:bookmarkStart w:id="59" w:name="references"/>
     <w:p>
       <w:pPr>
         <w:pStyle w:val="Heading1"/>
@@ -4662,7 +4714,7 @@
         <w:t xml:space="preserve">, btae200 (2024). https://doi.org/10.1093/bioinformatics/btae200</w:t>
       </w:r>
     </w:p>
-    <w:bookmarkEnd w:id="58"/>
+    <w:bookmarkEnd w:id="59"/>
     <w:sectPr/>
   </w:body>
 </w:document>

</xml_diff>

<commit_message>
Release v1.0.0: preprint edition with 147-word abstract
Co-Authored-By: Claude Opus 5.5 <noreply@anthropic.com>
</commit_message>
<xml_diff>
--- a/paper/manuscript.docx
+++ b/paper/manuscript.docx
@@ -95,13 +95,13 @@
         <w:pStyle w:val="Date"/>
       </w:pPr>
       <w:r>
-        <w:t xml:space="preserve">30</w:t>
-      </w:r>
-      <w:r>
-        <w:t xml:space="preserve"> </w:t>
-      </w:r>
-      <w:r>
-        <w:t xml:space="preserve">September</w:t>
+        <w:t xml:space="preserve">1</w:t>
+      </w:r>
+      <w:r>
+        <w:t xml:space="preserve"> </w:t>
+      </w:r>
+      <w:r>
+        <w:t xml:space="preserve">October</w:t>
       </w:r>
       <w:r>
         <w:t xml:space="preserve"> </w:t>
@@ -119,13 +119,13 @@
           <w:bCs/>
           <w:b/>
         </w:rPr>
-        <w:t xml:space="preserve">Article type:</w:t>
-      </w:r>
-      <w:r>
-        <w:t xml:space="preserve"> </w:t>
-      </w:r>
-      <w:r>
-        <w:t xml:space="preserve">Analysis</w:t>
+        <w:t xml:space="preserve">Preprint — not peer reviewed.</w:t>
+      </w:r>
+      <w:r>
+        <w:t xml:space="preserve"> </w:t>
+      </w:r>
+      <w:r>
+        <w:t xml:space="preserve">Version 1.0, 1 October 2026. Licence: CC BY 4.0.</w:t>
       </w:r>
       <w:r>
         <w:t xml:space="preserve"> </w:t>
@@ -135,17 +135,13 @@
           <w:bCs/>
           <w:b/>
         </w:rPr>
-        <w:t xml:space="preserve">Target journal:</w:t>
-      </w:r>
-      <w:r>
-        <w:t xml:space="preserve"> </w:t>
-      </w:r>
-      <w:r>
-        <w:rPr>
-          <w:iCs/>
-          <w:i/>
-        </w:rPr>
-        <w:t xml:space="preserve">Nature Aging</w:t>
+        <w:t xml:space="preserve">Affiliation:</w:t>
+      </w:r>
+      <w:r>
+        <w:t xml:space="preserve"> </w:t>
+      </w:r>
+      <w:r>
+        <w:t xml:space="preserve">Metastate Bio Inc, Wilmington, Delaware, USA</w:t>
       </w:r>
       <w:r>
         <w:t xml:space="preserve"> </w:t>
@@ -155,35 +151,13 @@
           <w:bCs/>
           <w:b/>
         </w:rPr>
-        <w:t xml:space="preserve">Affiliation:</w:t>
-      </w:r>
-      <w:r>
-        <w:t xml:space="preserve"> </w:t>
-      </w:r>
-      <w:r>
-        <w:t xml:space="preserve">Metastate Bio Inc, Wilmington, Delaware, USA</w:t>
-      </w:r>
-      <w:r>
-        <w:t xml:space="preserve"> </w:t>
-      </w:r>
-      <w:r>
-        <w:rPr>
-          <w:bCs/>
-          <w:b/>
-        </w:rPr>
         <w:t xml:space="preserve">Corresponding author:</w:t>
       </w:r>
       <w:r>
         <w:t xml:space="preserve"> </w:t>
       </w:r>
       <w:r>
-        <w:t xml:space="preserve">Oğuzcan Ünver; can@metastate.bio; ORCID:</w:t>
-      </w:r>
-      <w:r>
-        <w:t xml:space="preserve"> </w:t>
-      </w:r>
-      <w:r>
-        <w:t xml:space="preserve">0009-0007-2023-5084</w:t>
+        <w:t xml:space="preserve">Oğuzcan Ünver; can@metastate.bio; ORCID: 0009-0007-2023-5084</w:t>
       </w:r>
     </w:p>
     <w:bookmarkStart w:id="39" w:name="abstract"/>
@@ -200,85 +174,73 @@
         <w:pStyle w:val="FirstParagraph"/>
       </w:pPr>
       <w:r>
-        <w:t xml:space="preserve">Chronological-age models are used as scalar measures of cellular rejuvenation, although age</w:t>
-      </w:r>
-      <w:r>
-        <w:t xml:space="preserve"> </w:t>
-      </w:r>
-      <w:r>
-        <w:t xml:space="preserve">prediction does not establish sensitivity to beneficial intervention. We constructed a temporally</w:t>
-      </w:r>
-      <w:r>
-        <w:t xml:space="preserve"> </w:t>
-      </w:r>
-      <w:r>
-        <w:t xml:space="preserve">locked four-axis framework from public data available by 2024, challenged it against later studies</w:t>
-      </w:r>
-      <w:r>
-        <w:t xml:space="preserve"> </w:t>
-      </w:r>
-      <w:r>
-        <w:t xml:space="preserve">without refitting, and compared five evaluable age directions across 184 partial-reprogramming</w:t>
-      </w:r>
-      <w:r>
-        <w:t xml:space="preserve"> </w:t>
-      </w:r>
-      <w:r>
-        <w:t xml:space="preserve">contrasts. The frozen positive framework failed its human chemical and trajectory-order endpoints.</w:t>
-      </w:r>
-      <w:r>
-        <w:t xml:space="preserve"> </w:t>
-      </w:r>
-      <w:r>
-        <w:t xml:space="preserve">All five benchmark models oriented two independent young–old controls correctly, but their median</w:t>
-      </w:r>
-      <w:r>
-        <w:t xml:space="preserve"> </w:t>
-      </w:r>
-      <w:r>
-        <w:t xml:space="preserve">pairwise agreement on intervention direction was 0.745. Equal weighting across 14 study families</w:t>
-      </w:r>
-      <w:r>
-        <w:t xml:space="preserve"> </w:t>
-      </w:r>
-      <w:r>
-        <w:t xml:space="preserve">reduced agreement to 0.623 (family-cluster bootstrap 95% interval 0.515–0.738). No model was</w:t>
-      </w:r>
-      <w:r>
-        <w:t xml:space="preserve"> </w:t>
-      </w:r>
-      <w:r>
-        <w:t xml:space="preserve">youthward in more than five of eight source-labelled favourable families. Cross-family gene effects</w:t>
-      </w:r>
-      <w:r>
-        <w:t xml:space="preserve"> </w:t>
-      </w:r>
-      <w:r>
-        <w:t xml:space="preserve">were weakly concordant relative to the within-family reproducibility estimable in four families. A</w:t>
-      </w:r>
-      <w:r>
-        <w:t xml:space="preserve"> </w:t>
-      </w:r>
-      <w:r>
-        <w:t xml:space="preserve">post-review exploratory application of the contemporary Pasta model oriented both age controls but</w:t>
-      </w:r>
-      <w:r>
-        <w:t xml:space="preserve"> </w:t>
-      </w:r>
-      <w:r>
-        <w:t xml:space="preserve">was positive in only four of eight favourable families. These results show that age prediction did</w:t>
-      </w:r>
-      <w:r>
-        <w:t xml:space="preserve"> </w:t>
-      </w:r>
-      <w:r>
-        <w:t xml:space="preserve">not establish intervention portability for the evaluated directions. Rejuvenation claims require</w:t>
-      </w:r>
-      <w:r>
-        <w:t xml:space="preserve"> </w:t>
-      </w:r>
-      <w:r>
-        <w:t xml:space="preserve">intervention-specific and orthogonal qualification.</w:t>
+        <w:t xml:space="preserve">Chronological-age models are often used as scalar measures of cellular rejuvenation, but age</w:t>
+      </w:r>
+      <w:r>
+        <w:t xml:space="preserve"> </w:t>
+      </w:r>
+      <w:r>
+        <w:t xml:space="preserve">prediction does not establish sensitivity to beneficial intervention. We froze a four-axis framework</w:t>
+      </w:r>
+      <w:r>
+        <w:t xml:space="preserve"> </w:t>
+      </w:r>
+      <w:r>
+        <w:t xml:space="preserve">built from public data available by 2024, challenged it against later studies without refitting, and</w:t>
+      </w:r>
+      <w:r>
+        <w:t xml:space="preserve"> </w:t>
+      </w:r>
+      <w:r>
+        <w:t xml:space="preserve">compared five evaluable age directions across 184 partial-reprogramming contrasts. The frozen</w:t>
+      </w:r>
+      <w:r>
+        <w:t xml:space="preserve"> </w:t>
+      </w:r>
+      <w:r>
+        <w:t xml:space="preserve">framework failed its chemical and trajectory-order endpoints. All five models oriented two</w:t>
+      </w:r>
+      <w:r>
+        <w:t xml:space="preserve"> </w:t>
+      </w:r>
+      <w:r>
+        <w:t xml:space="preserve">independent young–old controls, and their median pairwise agreement on intervention direction was</w:t>
+      </w:r>
+      <w:r>
+        <w:t xml:space="preserve"> </w:t>
+      </w:r>
+      <w:r>
+        <w:t xml:space="preserve">0.745, indicating a shared component. Weighting 14 study families equally reduced agreement to 0.623</w:t>
+      </w:r>
+      <w:r>
+        <w:t xml:space="preserve"> </w:t>
+      </w:r>
+      <w:r>
+        <w:t xml:space="preserve">(family-cluster bootstrap 95% interval 0.515–0.738), below the locked 0.80 criterion. No model was</w:t>
+      </w:r>
+      <w:r>
+        <w:t xml:space="preserve"> </w:t>
+      </w:r>
+      <w:r>
+        <w:t xml:space="preserve">youthward in more than five of eight favourable-labelled families, and cross-family gene effects</w:t>
+      </w:r>
+      <w:r>
+        <w:t xml:space="preserve"> </w:t>
+      </w:r>
+      <w:r>
+        <w:t xml:space="preserve">converged weakly. An exploratory application of the contemporary Pasta model was positive in four of</w:t>
+      </w:r>
+      <w:r>
+        <w:t xml:space="preserve"> </w:t>
+      </w:r>
+      <w:r>
+        <w:t xml:space="preserve">eight such families. Transcriptomic youthward movement therefore requires intervention-specific,</w:t>
+      </w:r>
+      <w:r>
+        <w:t xml:space="preserve"> </w:t>
+      </w:r>
+      <w:r>
+        <w:t xml:space="preserve">orthogonal qualification before being described as rejuvenation.</w:t>
       </w:r>
     </w:p>
     <w:p>
@@ -3548,7 +3510,7 @@
         <w:pStyle w:val="FirstParagraph"/>
       </w:pPr>
       <w:r>
-        <w:t xml:space="preserve">All expression data are public under the GEO accessions listed above. The submission bundle includes</w:t>
+        <w:t xml:space="preserve">All expression data are public under the GEO accessions listed above. The release bundle includes</w:t>
       </w:r>
       <w:r>
         <w:t xml:space="preserve"> </w:t>
@@ -3560,7 +3522,7 @@
         <w:t xml:space="preserve"> </w:t>
       </w:r>
       <w:r>
-        <w:t xml:space="preserve">The reviewed manuscript repository will be made publicly available at</w:t>
+        <w:t xml:space="preserve">Code, frozen configurations, hashes, tests and aggregate results are publicly available at</w:t>
       </w:r>
       <w:r>
         <w:t xml:space="preserve"> </w:t>
@@ -3574,26 +3536,22 @@
         </w:r>
       </w:hyperlink>
       <w:r>
-        <w:t xml:space="preserve">. The immutable archival</w:t>
-      </w:r>
-      <w:r>
-        <w:t xml:space="preserve"> </w:t>
-      </w:r>
-      <w:r>
-        <w:t xml:space="preserve">DOI will be inserted before submission:</w:t>
-      </w:r>
-      <w:r>
-        <w:t xml:space="preserve"> </w:t>
-      </w:r>
-      <w:r>
-        <w:rPr>
-          <w:bCs/>
-          <w:b/>
-        </w:rPr>
-        <w:t xml:space="preserve">[ZENODO DOI — REQUIRED BEFORE SUBMISSION]</w:t>
-      </w:r>
-      <w:r>
-        <w:t xml:space="preserve">.</w:t>
+        <w:t xml:space="preserve"> </w:t>
+      </w:r>
+      <w:r>
+        <w:t xml:space="preserve">(release</w:t>
+      </w:r>
+      <w:r>
+        <w:t xml:space="preserve"> </w:t>
+      </w:r>
+      <w:r>
+        <w:rPr>
+          <w:rStyle w:val="VerbatimChar"/>
+        </w:rPr>
+        <w:t xml:space="preserve">v1.0.0</w:t>
+      </w:r>
+      <w:r>
+        <w:t xml:space="preserve">).</w:t>
       </w:r>
     </w:p>
     <w:bookmarkEnd w:id="53"/>
@@ -3611,27 +3569,13 @@
         <w:pStyle w:val="FirstParagraph"/>
       </w:pPr>
       <w:r>
-        <w:t xml:space="preserve">The complete analysis and figure code, frozen configurations, tests and aggregate result tables will</w:t>
-      </w:r>
-      <w:r>
-        <w:t xml:space="preserve"> </w:t>
-      </w:r>
-      <w:r>
-        <w:t xml:space="preserve">be made publicly available at</w:t>
-      </w:r>
-      <w:r>
-        <w:t xml:space="preserve"> </w:t>
-      </w:r>
-      <w:hyperlink r:id="rId52">
-        <w:r>
-          <w:rPr>
-            <w:rStyle w:val="Hyperlink"/>
-          </w:rPr>
-          <w:t xml:space="preserve">https://github.com/otcan/transcriptomic-reprogramming-portability</w:t>
-        </w:r>
-      </w:hyperlink>
-      <w:r>
-        <w:t xml:space="preserve">. Immutable commits and</w:t>
+        <w:t xml:space="preserve">The complete analysis and figure code, frozen configurations, tests and aggregate result tables are</w:t>
+      </w:r>
+      <w:r>
+        <w:t xml:space="preserve"> </w:t>
+      </w:r>
+      <w:r>
+        <w:t xml:space="preserve">provided in the analysis repository described under Data availability. Immutable commits and</w:t>
       </w:r>
       <w:r>
         <w:t xml:space="preserve"> </w:t>

</xml_diff>